<commit_message>
Record per-route conformance in the audit; 9.C is now fully closed
9.C moves from "the guards are pinned but nothing proves each route calls them"
to closed, with the exemption-list design written down rather than left for a
reader to discover in the test file: seven routes legitimately skip CSRF, eight
skip identity or throttling, each with a stated reason, and three meta-tests
fail the build when an exemption names a deleted route, names a route that now
carries the guard anyway, or gives no real justification.

The entry also records what the survey found, which was nothing - both
unthrottled state-changing routes are requireAdmin plus CSRF. A checklist item
that closes because the code was already correct should say so, otherwise the
next reader assumes something was fixed and goes looking for the diff.

13.3 loses per-route coverage; 13.4 gains it. Audit 36pp, complete set 96pp,
both regenerated and confirmed to open.

Co-Authored-By: Claude Opus 5 <noreply@anthropic.com>
</commit_message>
<xml_diff>
--- a/Gridiron_Complete_Documentation.docx
+++ b/Gridiron_Complete_Documentation.docx
@@ -30317,7 +30317,7 @@
                 <w:sz w:val="19"/>
                 <w:szCs w:val="19"/>
               </w:rPr>
-              <w:t xml:space="preserve">ab645a7 (main) — verification cycle of 13 August 2026; original audit at 49d074e</w:t>
+              <w:t xml:space="preserve">12be24e (main) — verification cycle of 13 August 2026; original audit at 49d074e</w:t>
             </w:r>
           </w:p>
         </w:tc>
@@ -41145,7 +41145,7 @@
                 <w:sz w:val="19"/>
                 <w:szCs w:val="19"/>
               </w:rPr>
-              <w:t xml:space="preserve">Extend route-level test coverage beyond the guard layer</w:t>
+              <w:t xml:space="preserve">Extend route-level test coverage beyond the guard layer — DONE</w:t>
             </w:r>
           </w:p>
         </w:tc>
@@ -41170,14 +41170,14 @@
                 <w:sz w:val="19"/>
                 <w:szCs w:val="19"/>
               </w:rPr>
-              <w:t xml:space="preserve">The unit suite pins the shared guards every route passes through, which is the highest-leverage seam — but per-route tests of auth, ownership and error shapes would catch wiring mistakes the guard tests cannot.</w:t>
+              <w:t xml:space="preserve">Closed 13 August. tests/routes.test.ts walks all 53 route handlers and asserts the contract each must satisfy: every state-changing route refuses a cross-origin request, establishes who is calling and is throttled; everything under /api/admin requires an admin; everything under /api/cron fails closed on a shared secret; every money boundary re-checks compliance server-side. Static rather than executed, deliberately — it cannot prove a guard runs on every code path, but it needs no Supabase, no network and no fixtures, so it runs in milliseconds on every commit and can never be skipped because the environment is missing. The exemption lists are the design: seven routes legitimately skip CSRF and eight skip identity or throttling — the Stripe webhook, the auth routes that create identity, the 410 tombstones, the 404 catch-all — each with a stated reason, and three meta-tests fail the build if an exemption names a deleted route, names a route that now carries the guard anyway, or gives no real reason. A list of blanket permissions nobody revisits is how a control quietly stops applying. Verified by regression rather than assumed: removing assertSameOrigin from a payout route fails, removing requireAdmin fails, and adding a guard to an exempt route fails as a stale exemption. The survey found no genuine gaps — the two unthrottled state-changing routes are both requireAdmin plus CSRF. Unit suite 34 to 50 tests.</w:t>
             </w:r>
           </w:p>
         </w:tc>
         <w:tc>
           <w:tcPr>
             <w:tcW w:type="dxa" w:w="1580"/>
-            <w:shd w:fill="FFF3CD" w:color="auto" w:val="clear"/>
+            <w:shd w:fill="D1E7DD" w:color="auto" w:val="clear"/>
             <w:tcMar>
               <w:top w:type="dxa" w:w="80"/>
               <w:left w:type="dxa" w:w="120"/>
@@ -41195,11 +41195,11 @@
                 <w:rFonts w:ascii="Calibri" w:cs="Calibri" w:eastAsia="Calibri" w:hAnsi="Calibri"/>
                 <w:b/>
                 <w:bCs/>
-                <w:color w:val="664D03"/>
+                <w:color w:val="0F5132"/>
                 <w:sz w:val="19"/>
                 <w:szCs w:val="19"/>
               </w:rPr>
-              <w:t xml:space="preserve">Medium</w:t>
+              <w:t xml:space="preserve">Done</w:t>
             </w:r>
           </w:p>
         </w:tc>
@@ -53871,7 +53871,7 @@
           <w:sz w:val="21"/>
           <w:szCs w:val="21"/>
         </w:rPr>
-        <w:t xml:space="preserve">Per-route test coverage beyond the shared guard layer. The guards are the highest-leverage seam and are pinned; per-route auth and ownership tests would catch wiring mistakes the guard tests structurally cannot. (9.C, Medium)</w:t>
+        <w:t xml:space="preserve">A manual screen-reader pass. The browser suite now pins accessible naming, keyboard operability and focus visibility, and closing it found that every auth field was unlabelled — but automation cannot judge whether the announced order makes sense to a person. (9.D, Medium)</w:t>
       </w:r>
     </w:p>
     <w:p>
@@ -53889,7 +53889,7 @@
           <w:sz w:val="21"/>
           <w:szCs w:val="21"/>
         </w:rPr>
-        <w:t xml:space="preserve">A manual screen-reader pass. The browser suite now pins accessible naming, keyboard operability and focus visibility, and closing it found that every auth field was unlabelled — but automation cannot judge whether the announced order makes sense to a person. (9.D, Medium)</w:t>
+        <w:t xml:space="preserve">One interactive sign-in after the @supabase/ssr 0.5 → 0.12 upgrade, which changed session cookie handling. Anonymous rejection is verified; a successful login is not. (9.D, Medium)</w:t>
       </w:r>
     </w:p>
     <w:p>
@@ -53907,7 +53907,38 @@
           <w:sz w:val="21"/>
           <w:szCs w:val="21"/>
         </w:rPr>
-        <w:t xml:space="preserve">One interactive sign-in after the @supabase/ssr 0.5 → 0.12 upgrade, which changed session cookie handling. Anonymous rejection is verified; a successful login is not. (9.D, Medium)</w:t>
+        <w:t xml:space="preserve">A staging environment mirroring production, so money-path changes are exercised somewhere real first. (9.E, Medium)</w:t>
+      </w:r>
+    </w:p>
+    <w:p>
+      <w:pPr>
+        <w:pStyle w:val="Heading2"/>
+        <w:spacing w:after="140" w:before="280"/>
+      </w:pPr>
+      <w:r>
+        <w:rPr>
+          <w:rFonts w:ascii="Calibri" w:cs="Calibri" w:eastAsia="Calibri" w:hAnsi="Calibri"/>
+          <w:b/>
+          <w:bCs/>
+          <w:color w:val="1F3864"/>
+          <w:sz w:val="26"/>
+          <w:szCs w:val="26"/>
+        </w:rPr>
+        <w:t xml:space="preserve">13.4  What was closed for handover on 13 August</w:t>
+      </w:r>
+    </w:p>
+    <w:p>
+      <w:pPr>
+        <w:spacing w:after="120" w:line="276"/>
+      </w:pPr>
+      <w:r>
+        <w:rPr>
+          <w:rFonts w:ascii="Calibri" w:cs="Calibri" w:eastAsia="Calibri" w:hAnsi="Calibri"/>
+          <w:color w:val="1A1A1A"/>
+          <w:sz w:val="21"/>
+          <w:szCs w:val="21"/>
+        </w:rPr>
+        <w:t xml:space="preserve">Recorded so the client's engineer can see these are deliberate, not accidental:</w:t>
       </w:r>
     </w:p>
     <w:p>
@@ -53925,38 +53956,7 @@
           <w:sz w:val="21"/>
           <w:szCs w:val="21"/>
         </w:rPr>
-        <w:t xml:space="preserve">A staging environment mirroring production, so money-path changes are exercised somewhere real first. (9.E, Medium)</w:t>
-      </w:r>
-    </w:p>
-    <w:p>
-      <w:pPr>
-        <w:pStyle w:val="Heading2"/>
-        <w:spacing w:after="140" w:before="280"/>
-      </w:pPr>
-      <w:r>
-        <w:rPr>
-          <w:rFonts w:ascii="Calibri" w:cs="Calibri" w:eastAsia="Calibri" w:hAnsi="Calibri"/>
-          <w:b/>
-          <w:bCs/>
-          <w:color w:val="1F3864"/>
-          <w:sz w:val="26"/>
-          <w:szCs w:val="26"/>
-        </w:rPr>
-        <w:t xml:space="preserve">13.4  What was closed for handover on 13 August</w:t>
-      </w:r>
-    </w:p>
-    <w:p>
-      <w:pPr>
-        <w:spacing w:after="120" w:line="276"/>
-      </w:pPr>
-      <w:r>
-        <w:rPr>
-          <w:rFonts w:ascii="Calibri" w:cs="Calibri" w:eastAsia="Calibri" w:hAnsi="Calibri"/>
-          <w:color w:val="1A1A1A"/>
-          <w:sz w:val="21"/>
-          <w:szCs w:val="21"/>
-        </w:rPr>
-        <w:t xml:space="preserve">Recorded so the client's engineer can see these are deliberate, not accidental:</w:t>
+        <w:t xml:space="preserve">Deployment pipeline unblocked and guarded — the reason none of the compliance layer had reached users. (Section 12.1)</w:t>
       </w:r>
     </w:p>
     <w:p>
@@ -53974,7 +53974,7 @@
           <w:sz w:val="21"/>
           <w:szCs w:val="21"/>
         </w:rPr>
-        <w:t xml:space="preserve">Deployment pipeline unblocked and guarded — the reason none of the compliance layer had reached users. (Section 12.1)</w:t>
+        <w:t xml:space="preserve">Health and readiness probe, plus the error-digest pager. Severity is split deliberately: missing money-path credentials report degraded at HTTP 200, not 503, because a probe that screams through the whole provisioning period is one nobody reads on the day it matters. Core config failure and a genuinely unreachable database still return 503.</w:t>
       </w:r>
     </w:p>
     <w:p>
@@ -53992,7 +53992,7 @@
           <w:sz w:val="21"/>
           <w:szCs w:val="21"/>
         </w:rPr>
-        <w:t xml:space="preserve">Health and readiness probe, plus the error-digest pager. Severity is split deliberately: missing money-path credentials report degraded at HTTP 200, not 503, because a probe that screams through the whole provisioning period is one nobody reads on the day it matters. Core config failure and a genuinely unreachable database still return 503.</w:t>
+        <w:t xml:space="preserve">Admin MFA completed end to end — enforcement plus the enrolment screen that was stranded in an unmerged PR.</w:t>
       </w:r>
     </w:p>
     <w:p>
@@ -54010,7 +54010,7 @@
           <w:sz w:val="21"/>
           <w:szCs w:val="21"/>
         </w:rPr>
-        <w:t xml:space="preserve">Admin MFA completed end to end — enforcement plus the enrolment screen that was stranded in an unmerged PR.</w:t>
+        <w:t xml:space="preserve">The bootstrap endpoint made self-disabling, removing a manual cleanup step that a handover would very likely have lost.</w:t>
       </w:r>
     </w:p>
     <w:p>
@@ -54028,7 +54028,7 @@
           <w:sz w:val="21"/>
           <w:szCs w:val="21"/>
         </w:rPr>
-        <w:t xml:space="preserve">The bootstrap endpoint made self-disabling, removing a manual cleanup step that a handover would very likely have lost.</w:t>
+        <w:t xml:space="preserve">Dependency upgrades merged with their breaking changes resolved, and two that would have silently disabled the lint gate held back with the reason recorded in .github/dependabot.yml.</w:t>
       </w:r>
     </w:p>
     <w:p>
@@ -54046,7 +54046,7 @@
           <w:sz w:val="21"/>
           <w:szCs w:val="21"/>
         </w:rPr>
-        <w:t xml:space="preserve">Dependency upgrades merged with their breaking changes resolved, and two that would have silently disabled the lint gate held back with the reason recorded in .github/dependabot.yml.</w:t>
+        <w:t xml:space="preserve">Support/dispute procedure and admin bootstrap/offboarding written into docs/RUNBOOK.md §§5–6, with every table name verified against the live database.</w:t>
       </w:r>
     </w:p>
     <w:p>
@@ -54064,7 +54064,7 @@
           <w:sz w:val="21"/>
           <w:szCs w:val="21"/>
         </w:rPr>
-        <w:t xml:space="preserve">Support/dispute procedure and admin bootstrap/offboarding written into docs/RUNBOOK.md §§5–6, with every table name verified against the live database.</w:t>
+        <w:t xml:space="preserve">Browser-level end-to-end tests at desktop and mobile viewports, which found that every auth input was unlabelled to a screen reader. (Section 12.6)</w:t>
       </w:r>
     </w:p>
     <w:p>
@@ -54082,7 +54082,7 @@
           <w:sz w:val="21"/>
           <w:szCs w:val="21"/>
         </w:rPr>
-        <w:t xml:space="preserve">Browser-level end-to-end tests at desktop and mobile viewports, which found that every auth input was unlabelled to a screen reader. (Section 12.6)</w:t>
+        <w:t xml:space="preserve">Post-deploy verification: both black-box suites now run automatically against the live site after every production deploy — the only kind of check that can catch a commit which merges green and never ships.</w:t>
       </w:r>
     </w:p>
     <w:p>
@@ -54100,7 +54100,7 @@
           <w:sz w:val="21"/>
           <w:szCs w:val="21"/>
         </w:rPr>
-        <w:t xml:space="preserve">Post-deploy verification: both black-box suites now run automatically against the live site after every production deploy — the only kind of check that can catch a commit which merges green and never ships.</w:t>
+        <w:t xml:space="preserve">The handover document itself, which Word had never been able to open, and a CI guard so no generator can emit an unopenable file again. (Section 12.8)</w:t>
       </w:r>
     </w:p>
     <w:p>
@@ -54118,7 +54118,7 @@
           <w:sz w:val="21"/>
           <w:szCs w:val="21"/>
         </w:rPr>
-        <w:t xml:space="preserve">The handover document itself, which Word had never been able to open, and a CI guard so no generator can emit an unopenable file again. (Section 12.8)</w:t>
+        <w:t xml:space="preserve">Per-route guard conformance across all 53 handlers, with exemption lists that fail the build when they go stale rather than quietly outliving their reasons.</w:t>
       </w:r>
     </w:p>
     <w:p>

</xml_diff>

<commit_message>
Record the final sweep in the audit (12.11)
One gap found, documentation not vulnerability; the invariant that closes the
class permanently; and the re-verification of every other layer. Cover updated
to 61207be. Audit 38pp, complete set 99pp, both open in Word.

Co-Authored-By: Claude Fable 5 <noreply@anthropic.com>
</commit_message>
<xml_diff>
--- a/Gridiron_Complete_Documentation.docx
+++ b/Gridiron_Complete_Documentation.docx
@@ -30317,7 +30317,7 @@
                 <w:sz w:val="19"/>
                 <w:szCs w:val="19"/>
               </w:rPr>
-              <w:t xml:space="preserve">0b7a89a (main) — verification and provisioning cycle of 13–14 August 2026; original audit at 49d074e</w:t>
+              <w:t xml:space="preserve">61207be (main) — verification, provisioning and final sweep, 13–14 August 2026; original audit at 49d074e</w:t>
             </w:r>
           </w:p>
         </w:tc>
@@ -53395,7 +53395,106 @@
           <w:sz w:val="26"/>
           <w:szCs w:val="26"/>
         </w:rPr>
-        <w:t xml:space="preserve">12.11  Verification performed</w:t>
+        <w:t xml:space="preserve">12.11  Final sweep — 14 August</w:t>
+      </w:r>
+    </w:p>
+    <w:p>
+      <w:pPr>
+        <w:spacing w:after="120" w:line="276"/>
+      </w:pPr>
+      <w:r>
+        <w:rPr>
+          <w:rFonts w:ascii="Calibri" w:cs="Calibri" w:eastAsia="Calibri" w:hAnsi="Calibri"/>
+          <w:color w:val="1A1A1A"/>
+          <w:sz w:val="21"/>
+          <w:szCs w:val="21"/>
+        </w:rPr>
+        <w:t xml:space="preserve">A closing pass re-verified every layer against the live system rather than trusting the previous day's green: Supabase security advisors with the grants behind them queried directly, live response headers, the frontend swept for injection sinks and unsafe redirects, runtime error history, all seven CI gates, and both black-box suites.</w:t>
+      </w:r>
+    </w:p>
+    <w:p>
+      <w:pPr>
+        <w:spacing w:after="120" w:line="276"/>
+      </w:pPr>
+      <w:r>
+        <w:rPr>
+          <w:rFonts w:ascii="Calibri" w:cs="Calibri" w:eastAsia="Calibri" w:hAnsi="Calibri"/>
+          <w:color w:val="1A1A1A"/>
+          <w:sz w:val="21"/>
+          <w:szCs w:val="21"/>
+        </w:rPr>
+        <w:t xml:space="preserve">It found exactly one gap, and it was documentation rather than a vulnerability: claim_pool_payout was the only client-executable SECURITY DEFINER function without the in-database justification comment this repository requires for advisor exceptions. The function itself is correct — identity from auth.uid(), FOR UPDATE serialisation, ledger-authoritative idempotency, and the unique-index backstop that makes a double credit impossible. The fix adds the comment and, more usefully, an in-migration invariant that fails if any future SECURITY DEFINER function is exposed to clients without a justification — so the convention is now enforced rather than remembered.</w:t>
+      </w:r>
+    </w:p>
+    <w:p>
+      <w:pPr>
+        <w:pStyle w:val="ListParagraph"/>
+        <w:numPr>
+          <w:ilvl w:val="0"/>
+          <w:numId w:val="6"/>
+        </w:numPr>
+        <w:spacing w:after="80" w:line="276"/>
+      </w:pPr>
+      <w:r>
+        <w:rPr>
+          <w:rFonts w:ascii="Calibri" w:cs="Calibri" w:eastAsia="Calibri" w:hAnsi="Calibri"/>
+          <w:sz w:val="21"/>
+          <w:szCs w:val="21"/>
+        </w:rPr>
+        <w:t xml:space="preserve">Money-mover RPCs (credit_user_balance, debit_user_balance, the fee setters) confirmed service-role only by direct privilege query — not callable by anon or authenticated.</w:t>
+      </w:r>
+    </w:p>
+    <w:p>
+      <w:pPr>
+        <w:pStyle w:val="ListParagraph"/>
+        <w:numPr>
+          <w:ilvl w:val="0"/>
+          <w:numId w:val="6"/>
+        </w:numPr>
+        <w:spacing w:after="80" w:line="276"/>
+      </w:pPr>
+      <w:r>
+        <w:rPr>
+          <w:rFonts w:ascii="Calibri" w:cs="Calibri" w:eastAsia="Calibri" w:hAnsi="Calibri"/>
+          <w:sz w:val="21"/>
+          <w:szCs w:val="21"/>
+        </w:rPr>
+        <w:t xml:space="preserve">app_errors held zero rows over 48 hours, and every Vercel runtime error group's last-seen timestamp predates the 13 August fixes. Production is quiet.</w:t>
+      </w:r>
+    </w:p>
+    <w:p>
+      <w:pPr>
+        <w:pStyle w:val="ListParagraph"/>
+        <w:numPr>
+          <w:ilvl w:val="0"/>
+          <w:numId w:val="6"/>
+        </w:numPr>
+        <w:spacing w:after="80" w:line="276"/>
+      </w:pPr>
+      <w:r>
+        <w:rPr>
+          <w:rFonts w:ascii="Calibri" w:cs="Calibri" w:eastAsia="Calibri" w:hAnsi="Calibri"/>
+          <w:sz w:val="21"/>
+          <w:szCs w:val="21"/>
+        </w:rPr>
+        <w:t xml:space="preserve">14 HTTP and 44 browser assertions pass against production; post-deploy verification green on this commit.</w:t>
+      </w:r>
+    </w:p>
+    <w:p>
+      <w:pPr>
+        <w:pStyle w:val="Heading2"/>
+        <w:spacing w:after="140" w:before="280"/>
+      </w:pPr>
+      <w:r>
+        <w:rPr>
+          <w:rFonts w:ascii="Calibri" w:cs="Calibri" w:eastAsia="Calibri" w:hAnsi="Calibri"/>
+          <w:b/>
+          <w:bCs/>
+          <w:color w:val="1F3864"/>
+          <w:sz w:val="26"/>
+          <w:szCs w:val="26"/>
+        </w:rPr>
+        <w:t xml:space="preserve">12.12  Verification performed</w:t>
       </w:r>
     </w:p>
     <w:p>

</xml_diff>